<commit_message>
NoppaKauppa: ratkaise tehtävänannon ristiriidat
SQLite on sovittu toteutustapa, ja työviikon 2 vertailu perustelee sen.
Käyttäjätarinat (kayttajatarinat.md) kuuluvat suunnitelma-aineistoon,
testimatriisi.md on testien ensisijainen paikka työviikosta 3, k2-selvitys on
oma tiedostonsa vue-pinia-selvitys.md ja linkitetty näyttömatriisi
nayttomatriisi.md. Julkiseen repoon vain roolit; ohjaaja on asiakkaan sijainen,
kunnes edustaja nimetään. Lataukset ja odotukset rakennettu uudelleen.

Co-Authored-By: Claude Opus 5.5 <noreply@anthropic.com>
</commit_message>
<xml_diff>
--- a/noppakauppa/downloads/nayton-dokumentointipohjat.docx
+++ b/noppakauppa/downloads/nayton-dokumentointipohjat.docx
@@ -901,7 +901,7 @@
           <w:sz w:val="21"/>
           <w:szCs w:val="21"/>
         </w:rPr>
-        <w:t xml:space="preserve">Keskustelukumppani, rooli ja pvm:</w:t>
+        <w:t xml:space="preserve">Keskustelukumppanin rooli (ei nimeä) ja pvm:</w:t>
       </w:r>
     </w:p>
     <w:p>
@@ -1025,7 +1025,7 @@
                 <w:sz w:val="19"/>
                 <w:szCs w:val="19"/>
               </w:rPr>
-              <w:t xml:space="preserve">Osallistujat ja roolit</w:t>
+              <w:t xml:space="preserve">Osallistujien roolit (ei nimiä)</w:t>
             </w:r>
           </w:p>
         </w:tc>
@@ -1075,7 +1075,7 @@
                 <w:sz w:val="19"/>
                 <w:szCs w:val="19"/>
               </w:rPr>
-              <w:t xml:space="preserve">Testaajan alkuperäinen havainto (hänen sanoillaan)</w:t>
+              <w:t xml:space="preserve">Testaajan havainto hänen sanoillaan (merkitse rooli, ei nimeä)</w:t>
             </w:r>
           </w:p>
         </w:tc>
@@ -1265,7 +1265,7 @@
           <w:sz w:val="21"/>
           <w:szCs w:val="21"/>
         </w:rPr>
-        <w:t xml:space="preserve">Erota aina testaajan sanat omasta tulkinnastasi.</w:t>
+        <w:t xml:space="preserve">Erota aina testaajan sanat omasta tulkinnastasi. Julkiseen repositoryyn kirjataan henkilöistä vain rooli; nimet ohjaajalle Teamsissa tarvittaessa.</w:t>
       </w:r>
     </w:p>
     <w:p>

</xml_diff>